<commit_message>
Add cover letter and update title page with author details
Co-Authored-By: Claude Sonnet 5.5 <noreply@anthropic.com>
Claude-Session: https://claude.ai/code/session_01LBjWUD7hbjfvwUj9dX3gFd
</commit_message>
<xml_diff>
--- a/dss_submission/DSS_title_page.docx
+++ b/dss_submission/DSS_title_page.docx
@@ -45,7 +45,7 @@
           <w:sz w:val="24"/>
           <w:szCs w:val="24"/>
         </w:rPr>
-        <w:t xml:space="preserve">[Given name Family name]</w:t>
+        <w:t xml:space="preserve">Ook Lee</w:t>
       </w:r>
       <w:r>
         <w:rPr>
@@ -54,46 +54,13 @@
           <w:szCs w:val="24"/>
           <w:vertAlign w:val="superscript"/>
         </w:rPr>
-        <w:t xml:space="preserve">a</w:t>
-      </w:r>
-      <w:r>
-        <w:rPr>
-          <w:rFonts w:ascii="Times New Roman" w:cs="Times New Roman" w:eastAsia="Times New Roman" w:hAnsi="Times New Roman"/>
-          <w:sz w:val="24"/>
-          <w:szCs w:val="24"/>
-        </w:rPr>
-        <w:t xml:space="preserve">, [Given name Family name]</w:t>
-      </w:r>
-      <w:r>
-        <w:rPr>
-          <w:rFonts w:ascii="Times New Roman" w:cs="Times New Roman" w:eastAsia="Times New Roman" w:hAnsi="Times New Roman"/>
-          <w:sz w:val="24"/>
-          <w:szCs w:val="24"/>
-          <w:vertAlign w:val="superscript"/>
-        </w:rPr>
-        <w:t xml:space="preserve">b</w:t>
-      </w:r>
-      <w:r>
-        <w:rPr>
-          <w:rFonts w:ascii="Times New Roman" w:cs="Times New Roman" w:eastAsia="Times New Roman" w:hAnsi="Times New Roman"/>
-          <w:sz w:val="24"/>
-          <w:szCs w:val="24"/>
-        </w:rPr>
-        <w:t xml:space="preserve">, [Given name Family name]</w:t>
-      </w:r>
-      <w:r>
-        <w:rPr>
-          <w:rFonts w:ascii="Times New Roman" w:cs="Times New Roman" w:eastAsia="Times New Roman" w:hAnsi="Times New Roman"/>
-          <w:sz w:val="24"/>
-          <w:szCs w:val="24"/>
-          <w:vertAlign w:val="superscript"/>
-        </w:rPr>
         <w:t xml:space="preserve">a,*</w:t>
       </w:r>
     </w:p>
     <w:p>
       <w:pPr>
-        <w:spacing w:after="40" w:line="360"/>
+        <w:spacing w:after="200" w:line="360"/>
+        <w:jc w:val="center"/>
       </w:pPr>
       <w:r>
         <w:rPr>
@@ -110,29 +77,7 @@
           <w:sz w:val="22"/>
           <w:szCs w:val="22"/>
         </w:rPr>
-        <w:t xml:space="preserve"> [Department, Institution, Street address, City, Postal code, Country]</w:t>
-      </w:r>
-    </w:p>
-    <w:p>
-      <w:pPr>
-        <w:spacing w:after="200" w:line="360"/>
-      </w:pPr>
-      <w:r>
-        <w:rPr>
-          <w:rFonts w:ascii="Times New Roman" w:cs="Times New Roman" w:eastAsia="Times New Roman" w:hAnsi="Times New Roman"/>
-          <w:sz w:val="24"/>
-          <w:szCs w:val="24"/>
-          <w:vertAlign w:val="superscript"/>
-        </w:rPr>
-        <w:t xml:space="preserve">b</w:t>
-      </w:r>
-      <w:r>
-        <w:rPr>
-          <w:rFonts w:ascii="Times New Roman" w:cs="Times New Roman" w:eastAsia="Times New Roman" w:hAnsi="Times New Roman"/>
-          <w:sz w:val="22"/>
-          <w:szCs w:val="22"/>
-        </w:rPr>
-        <w:t xml:space="preserve"> [Department, Institution, Street address, City, Postal code, Country]</w:t>
+        <w:t xml:space="preserve"> Department of Information System, Hanyang University, Seoul, Korea [add street address and postal code]</w:t>
       </w:r>
     </w:p>
     <w:p>
@@ -160,7 +105,7 @@
           <w:sz w:val="24"/>
           <w:szCs w:val="24"/>
         </w:rPr>
-        <w:t xml:space="preserve">* [Name], [e-mail address], [full postal address, including country]</w:t>
+        <w:t xml:space="preserve">* Ook Lee, ooklee@hanyang.ac.kr, Department of Information System, Hanyang University, Seoul, Korea [add street address and postal code]</w:t>
       </w:r>
     </w:p>
     <w:p>
@@ -220,7 +165,7 @@
           <w:sz w:val="24"/>
           <w:szCs w:val="24"/>
         </w:rPr>
-        <w:t xml:space="preserve">[The authors declare that they have no known competing financial interests or personal relationships that could have appeared to influence the work reported in this paper. / Authors to complete.]</w:t>
+        <w:t xml:space="preserve">[The author declares that he has no known competing financial interests or personal relationships that could have appeared to influence the work reported in this paper. / Author to confirm.]</w:t>
       </w:r>
     </w:p>
     <w:p>
@@ -250,7 +195,7 @@
           <w:sz w:val="24"/>
           <w:szCs w:val="24"/>
         </w:rPr>
-        <w:t xml:space="preserve">[Authors to complete.]</w:t>
+        <w:t xml:space="preserve">[Author to complete.]</w:t>
       </w:r>
     </w:p>
     <w:p>
@@ -280,7 +225,7 @@
           <w:sz w:val="24"/>
           <w:szCs w:val="24"/>
         </w:rPr>
-        <w:t xml:space="preserve">[Author 1]: Conceptualization, Methodology, Formal analysis, Writing – original draft. [Author 2]: Software, Data curation, Validation, Visualization, Writing – review and editing. [Authors to assign roles from the CRediT taxonomy to match what each author actually did.]</w:t>
+        <w:t xml:space="preserve">Ook Lee: Conceptualization, Methodology, Formal analysis, Software, Data curation, Validation, Visualization, Writing – original draft, Writing – review and editing. [Draft: confirm the roles against what you actually did.]</w:t>
       </w:r>
     </w:p>
     <w:p>
@@ -310,7 +255,7 @@
           <w:sz w:val="24"/>
           <w:szCs w:val="24"/>
         </w:rPr>
-        <w:t xml:space="preserve">[Draft for the authors to verify and edit:] During the preparation of this work the authors used Claude (Anthropic) to edit the language of the manuscript, to derive and check the mathematical proofs in Appendix A, to regenerate the figures from the model, and to write and run the code for the archival analysis in Section 5.1. After using this tool, the authors reviewed and edited the content as needed and take full responsibility for the content of the published article.</w:t>
+        <w:t xml:space="preserve">[Draft for the author to verify and edit:] During the preparation of this work the author used Claude (Anthropic) to edit the language of the manuscript, to derive and check the mathematical proofs in Appendix A, to regenerate the figures from the model, and to write and run the code for the archival analysis in Section 5.1. After using this tool, the author reviewed and edited the content as needed and takes full responsibility for the content of the published article.</w:t>
       </w:r>
     </w:p>
     <w:p>
@@ -340,7 +285,7 @@
           <w:sz w:val="24"/>
           <w:szCs w:val="24"/>
         </w:rPr>
-        <w:t xml:space="preserve">[Authors to complete. The pseudonymized commit-level dataset and the analysis code should be deposited in a public data repository (for example Zenodo) and the persistent identifier cited here and in the submission system. The source repositories analyzed are public.]</w:t>
+        <w:t xml:space="preserve">[Author to complete. The pseudonymized commit-level dataset and the analysis code should be deposited in a public data repository (for example Zenodo) and the persistent identifier cited here and in the submission system. The source repositories analyzed are public.]</w:t>
       </w:r>
     </w:p>
     <w:sectPr>

</xml_diff>